<commit_message>
fix(reference.docx): CoverTopLine bold + TOCHeading inherit Heading1 size
- CoverTopLine: added <w:b/><w:bCs/> (was missing)
- TOCHeading: removed explicit <w:sz w:val="32"/> and <w:szCs w:val="32"/>
  → now purely inherits from Heading1 (PKU 16pt / THU 18pt)
- Note: Title and TitlePageDegree already had bold at style level;
  earlier red-team check was run-level only (false alarm)
</commit_message>
<xml_diff>
--- a/reference.docx
+++ b/reference.docx
@@ -905,8 +905,6 @@
       <w:rFonts w:ascii="Times New Roman" w:hAnsi="Times New Roman" w:eastAsia="SimHei" w:cs="Times New Roman"/>
       <w:b/>
       <w:bCs/>
-      <w:sz w:val="32"/>
-      <w:szCs w:val="32"/>
       <w:lang w:val="en-US" w:eastAsia="zh-CN"/>
     </w:rPr>
   </w:style>
@@ -1407,6 +1405,8 @@
       <w:sz w:val="32"/>
       <w:szCs w:val="32"/>
       <w:lang w:val="en-US" w:eastAsia="zh-CN"/>
+      <w:b/>
+      <w:bCs/>
     </w:rPr>
   </w:style>
   <w:style w:type="paragraph" w:styleId="CoverInfoLabel" w:customStyle="1">

</xml_diff>